<commit_message>
Actualizacion de inconsistncias en documentos de media importancia
</commit_message>
<xml_diff>
--- a/Fase 1/Evidencias Grupales/1.4_APT122_FormativaFase1_Informe.docx
+++ b/Fase 1/Evidencias Grupales/1.4_APT122_FormativaFase1_Informe.docx
@@ -1728,7 +1728,7 @@
     </w:p>
     <w:p>
       <w:r>
-        <w:t>Easy Office se dedica a formalizar emprendimientos y a gestionar toda la documentación que eso implica: creación de empresas, inicio de actividades, domicilio tributario, contratos, declaraciones juradas. Hoy ese trabajo se hace a mano: alguien rellena un contrato, lo sube a la plataforma de firma electrónica, lo descarga una vez firmado y se lo reenvía al cliente. Todo depende de que un agente esté disponible en ese momento, lo que genera esperas y le pone un techo a cuánto puede crecer la empresa sin contratar más gente.</w:t>
+        <w:t>Easy Office se dedica a formalizar emprendimientos y a gestionar toda la documentación que eso implica: creación de empresas, inicio de actividades, domicilio tributario, contratos, declaraciones juradas. Hoy ese trabajo se hace a mano: alguien rellena un contrato, lo sube a la plataforma de firma electrónica, lo descarga una vez firmado y se lo reenvía al cliente. Todo depende de que un agente esté disponible en ese momento, lo que genera esperas y le pone un techo a cuánto puede crecer la empresa sin contratar más gente. Easy Office tiene su casa matriz en la Región de Valparaíso y una sucursal en la Región Metropolitana, que es donde opera el equipo de agentes con el que trabaja este proyecto.</w:t>
       </w:r>
     </w:p>
     <w:p/>
@@ -1876,7 +1876,7 @@
         <w:t>Diego Navarrete</w:t>
       </w:r>
       <w:r>
-        <w:t>: Mi interés está centrado en el desarrollo de software y en las automatizaciones, más que en la gestión de personas o de proyectos. En este proyecto me tocó asumir el rol de líder y contacto directo con el cliente, lo cual es un reto para mi persona, ya que me exige traducir conversaciones de negocio en objetivos y en una arquitectura concreta, algo bastante distinto a lo que naturalmente más disfruto, que es el desarrollo técnico en sí.</w:t>
+        <w:t>: Mi interés está centrado en el desarrollo de software y en las automatizaciones, más que en la gestión de personas o de proyectos. En este proyecto me tocó asumir el rol de Product Owner y contacto directo con el cliente, lo cual es un reto para mi persona, ya que me exige traducir conversaciones de negocio en objetivos y en una arquitectura concreta, algo bastante distinto a lo que naturalmente más disfruto, que es el desarrollo técnico en sí.</w:t>
       </w:r>
     </w:p>
     <w:p/>
@@ -1900,7 +1900,7 @@
         <w:t xml:space="preserve">: </w:t>
       </w:r>
       <w:r>
-        <w:t xml:space="preserve">Mi interés está en la gestión de proyectos TI, particularmente en roles como Project Manager o Scrum Master, así como en el levantamiento y la documentación formal de requerimientos. En este proyecto asumo el rol de levantamiento documental, liderando el levantamiento de requerimientos con Easy Office, validando los criterios de aceptación de cada historia de usuario y consolidando la documentación formal del proyecto. Es exactamente el tipo de trabajo </w:t>
+        <w:t xml:space="preserve">Mi interés está en la gestión de proyectos TI, particularmente en roles como Project Manager o Scrum Master, así como en el levantamiento y la documentación formal de requerimientos. En este proyecto asumo el rol de Scrum Master, liderando el levantamiento de requerimientos con Easy Office, facilitando la planificación de cada sprint, validando los criterios de aceptación de cada historia de usuario y consolidando la documentación formal del proyecto. Es exactamente el tipo de trabajo </w:t>
       </w:r>
       <w:r>
         <w:lastRenderedPageBreak/>
@@ -1922,7 +1922,7 @@
         <w:t xml:space="preserve">: </w:t>
       </w:r>
       <w:r>
-        <w:t>Mi interés está en desarrollar soluciones y automatizaciones, y en asegurarme de que lo que se construye realmente funcione como se espera. En este proyecto asumo el rol de QA, definiendo y ejecutando el plan de pruebas del sistema, verificando que las funcionalidades construidas por el equipo cumplan los criterios de aceptación y entreguen información confiable antes de darlas por terminadas. Este proyecto me permite poner en práctica esa mirada de calidad sobre un sistema real, con un cliente real detrás.</w:t>
+        <w:t>Mi interés está en desarrollar soluciones y automatizaciones, y en asegurarme de que lo que se construye realmente funcione como se espera. En este proyecto asumo el rol de Developer con foco en QA, definiendo y ejecutando el plan de pruebas del sistema, verificando que las funcionalidades construidas por el equipo cumplan los criterios de aceptación y entreguen información confiable antes de darlas por terminadas. Este proyecto me permite poner en práctica esa mirada de calidad sobre un sistema real, con un cliente real detrás.</w:t>
       </w:r>
     </w:p>
     <w:p/>
@@ -2147,7 +2147,7 @@
     <w:p/>
     <w:p>
       <w:r>
-        <w:t>Por parte del equipo de desarrollo, Diego Navarrete lidera el proyecto y es el contacto directo con el cliente, encargado del levantamiento de requerimientos y la planificación general. Andrés Fernández se enfoca mayormente en la documentación formal del proyecto. Dunkan Hernández apoya en pruebas y desarrollo. Aunque todos participamos en todo, estos son los roles principales que determinamos en base a lo que exige la metodología que utilizamos.</w:t>
+        <w:t>Por parte del equipo de desarrollo, Diego Navarrete es el Product Owner del equipo y el contacto directo con el cliente, encargado del levantamiento de requerimientos y la planificación general. Andrés Fernández es el Scrum Master del equipo y se enfoca mayormente en la documentación formal del proyecto. Dunkan Hernández es Developer, con foco en pruebas (QA) y desarrollo. Aunque todos participamos en todo, estos son los roles principales que determinamos en base a lo que exige la metodología que utilizamos.</w:t>
       </w:r>
     </w:p>
     <w:p>
@@ -2199,7 +2199,7 @@
       </w:r>
       <w:proofErr w:type="spellEnd"/>
       <w:r>
-        <w:t xml:space="preserve"> de atención con inteligencia artificial.</w:t>
+        <w:t xml:space="preserve"> de atención con inteligencia artificial. La arquitectura del sistema debe permitir incorporar más tipos de documento en sprints futuros —una meta cercana son unos 10 o más, dentro del universo de los cuarenta y tantos trámites que maneja Easy Office hoy de forma manual—, aunque esa ampliación no forma parte de este MVP.</w:t>
       </w:r>
     </w:p>
     <w:p>
@@ -2282,7 +2282,7 @@
       </w:r>
       <w:proofErr w:type="spellEnd"/>
       <w:r>
-        <w:t xml:space="preserve"> de aproximadamente dos semanas. Cada uno parte con historias de usuario priorizadas desde el </w:t>
+        <w:t xml:space="preserve"> de aproximadamente tres semanas. Cada uno parte con historias de usuario priorizadas desde el </w:t>
       </w:r>
       <w:proofErr w:type="spellStart"/>
       <w:r>
@@ -2308,7 +2308,7 @@
     <w:p/>
     <w:p>
       <w:r>
-        <w:t>Funciones del equipo: Diego Navarrete lidera el proyecto y es el contacto directo con el cliente. Andrés Fernández se enfoca en la documentación formal y las evidencias que pide la asignatura. Dunkan Hernández apoya en pruebas y desarrollo. Las tareas de desarrollo se reparten entre los tres durante la planificación de cada sprint.</w:t>
+        <w:t>Funciones del equipo: Diego Navarrete es el Product Owner y el contacto directo con el cliente. Andrés Fernández es el Scrum Master y se enfoca en la documentación formal y las evidencias que pide la asignatura. Dunkan Hernández es Developer, con foco en pruebas y desarrollo. Las tareas de desarrollo se reparten entre los tres durante la planificación de cada sprint.</w:t>
       </w:r>
     </w:p>
     <w:p>
@@ -3796,7 +3796,7 @@
                 <w:sz w:val="22"/>
                 <w:szCs w:val="22"/>
               </w:rPr>
-              <w:t>Construcción incremental del CRM, priorizando el backlog.</w:t>
+              <w:t>Construcción incremental del CRM en 4 sprints de 3 semanas: Sprint 1 (S5-S7) mockups + clientes + backend base; Sprint 2 (S8-S10) contrato + firma electrónica; Sprint 3 (S11-S13) trazabilidad + roles; Sprint 4 (S14-S16) pruebas + Docker + manual técnico.</w:t>
             </w:r>
           </w:p>
         </w:tc>
@@ -3864,7 +3864,7 @@
                 <w:sz w:val="22"/>
                 <w:szCs w:val="22"/>
               </w:rPr>
-              <w:t>Semanas 6-14</w:t>
+              <w:t>Semanas 5-16</w:t>
             </w:r>
           </w:p>
         </w:tc>
@@ -4226,7 +4226,7 @@
                 <w:sz w:val="22"/>
                 <w:szCs w:val="22"/>
               </w:rPr>
-              <w:t>Empaquetado con Docker y preparación del entorno.</w:t>
+              <w:t>Empaquetado con Docker y preparación del entorno (parte del Sprint 4).</w:t>
             </w:r>
           </w:p>
         </w:tc>
@@ -4303,7 +4303,7 @@
                 <w:sz w:val="22"/>
                 <w:szCs w:val="22"/>
               </w:rPr>
-              <w:t>Semanas 15-16</w:t>
+              <w:t>Semanas 14-16</w:t>
             </w:r>
           </w:p>
         </w:tc>

</xml_diff>